<commit_message>
feat: pagaré con el formato nuevo (deudor, aval y testigos) y oficio de regresión de fases
- Pagaré (PDF, Word y API de la app): lleva deudor, aval (obligado solidario),
  lugar y fecha de suscripción, acreedor y domicilio de pago; importe,
  vencimiento, % de intereses y testigos quedan para llenarse a mano.
- Oficio de regresión de fases del contrato generado: en el panel y por URL
  firmada para la app (regresion_fases_url en /ver).

Co-Authored-By: Claude Opus 5.5 <noreply@anthropic.com>
</commit_message>
<xml_diff>
--- a/resources/documentos/formato-pagare.docx
+++ b/resources/documentos/formato-pagare.docx
@@ -11,57 +11,59 @@
         <w:t>PAGARÉ</w:t>
       </w:r>
     </w:p>
-    <w:p/>
-    <w:p>
-      <w:pPr>
-        <w:ind w:left="1440"/>
-      </w:pPr>
-      <w:r>
-        <w:t>CIUDAD DE PACHUCA DE SOTO, HIDALGO, A _____ DE _______________ DE 2026.</w:t>
-      </w:r>
-    </w:p>
-    <w:p>
-      <w:pPr>
-        <w:jc w:val="both"/>
-      </w:pPr>
-      <w:r>
-        <w:t xml:space="preserve">YO, C. ________________________________________________________, CON DOMICILIO EN __________________________________________________________, Y RFC: ______________________, EN ADELANTE "EL DEUDOR", RECONOZCO DEBER Y PAGAR INCONDICIONALMENTE A LA ORDEN DE </w:t>
-      </w:r>
+    <w:p>
+      <w:pPr>
+        <w:jc w:val="right"/>
+      </w:pPr>
       <w:r>
         <w:rPr>
           <w:b/>
           <w:bCs/>
         </w:rPr>
-        <w:t>C. JOSE ANTONIO SOLIS SANTUARIO</w:t>
-      </w:r>
-      <w:r>
-        <w:t>, CON DOMICILIO EN</w:t>
-      </w:r>
-      <w:r>
-        <w:t xml:space="preserve"> AVENIDA REVOLUCIÓN 1014 DESPACHO 55 PLAZA LAS MARIALUISAS COLONIA PERIODISTAS CÓDIGO POSTAL 42060 PACHUCA DE SOTO HIDALGO</w:t>
-      </w:r>
-      <w:r>
-        <w:t xml:space="preserve">, Y RFC: </w:t>
+        <w:t xml:space="preserve">BUENO POR: $____________________</w:t>
+      </w:r>
+    </w:p>
+    <w:p>
+      <w:pPr>
+        <w:jc w:val="left"/>
+      </w:pPr>
+      <w:r>
+        <w:t xml:space="preserve">Lugar y fecha de suscripción: {lugar}, a {fecha}.</w:t>
+      </w:r>
+    </w:p>
+    <w:p>
+      <w:pPr>
+        <w:jc w:val="left"/>
+      </w:pPr>
+      <w:r>
+        <w:t xml:space="preserve">Fecha de vencimiento: ______________________________________</w:t>
+      </w:r>
+    </w:p>
+    <w:p>
+      <w:pPr>
+        <w:spacing w:before="120"/>
+        <w:jc w:val="both"/>
+      </w:pPr>
+      <w:r>
+        <w:t xml:space="preserve">Por este pagaré, yo, {nombre}, prometo pagar incondicionalmente a la orden de </w:t>
       </w:r>
       <w:r>
         <w:rPr>
           <w:b/>
           <w:bCs/>
         </w:rPr>
-        <w:t>SOSA860530LM7</w:t>
-      </w:r>
-      <w:r>
-        <w:t>, EN ADELANTE "EL ACREEDOR", LA CANTIDAD DE:</w:t>
-      </w:r>
-    </w:p>
-    <w:p>
-      <w:r>
-        <w:t>1. IMPORTE: LA CANTIDAD DE $_____________ (_______________________________________ PESOS 00/100 M.N.).</w:t>
-      </w:r>
-    </w:p>
-    <w:p>
-      <w:r>
-        <w:t>2. VENCIMIENTO: EL PRESENTE PAGARÉ VENCERÁ EL DÍA _____ DE _______________ DE 20____, FECHA EN LA CUAL DEBERÁ EFECTUARSE EL PAGO TOTAL DEL IMPORTE.</w:t>
+        <w:t xml:space="preserve">{acreedor}</w:t>
+      </w:r>
+      <w:r>
+        <w:t xml:space="preserve">, la cantidad de:</w:t>
+      </w:r>
+    </w:p>
+    <w:p>
+      <w:pPr>
+        <w:jc w:val="left"/>
+      </w:pPr>
+      <w:r>
+        <w:t xml:space="preserve">$____________________ (________________________________________ PESOS 00/100 M.N.)</w:t>
       </w:r>
     </w:p>
     <w:p>
@@ -69,32 +71,84 @@
         <w:jc w:val="both"/>
       </w:pPr>
       <w:r>
-        <w:t>3. INTERESES: SE CAUSARÁN INTERESES MORATORIOS A RAZÓN DEL 3% ANUAL SOBRE SALDOS INSOLUTOS A PARTIR DEL DÍA SIGUIENTE AL VENCIMIENTO.</w:t>
-      </w:r>
-    </w:p>
-    <w:p>
-      <w:pPr>
-        <w:jc w:val="both"/>
-      </w:pPr>
-      <w:r>
-        <w:t xml:space="preserve">4. LUGAR DE PAGO: EL PAGO SE REALIZARÁ EN </w:t>
+        <w:t xml:space="preserve">Cantidad que pagaré en la fecha de vencimiento señalada, en el domicilio ubicado en: </w:t>
       </w:r>
       <w:r>
         <w:rPr>
           <w:b/>
           <w:bCs/>
         </w:rPr>
-        <w:t>PACHUCA DE SOTO</w:t>
-      </w:r>
+        <w:t xml:space="preserve">{domicilio_pago}</w:t>
+      </w:r>
+      <w:r>
+        <w:t xml:space="preserve">.</w:t>
+      </w:r>
+    </w:p>
+    <w:p>
+      <w:pPr>
+        <w:jc w:val="both"/>
+      </w:pPr>
+      <w:r>
+        <w:t xml:space="preserve">En caso de incumplimiento en el pago oportuno, me obligo a cubrir intereses moratorios a razón del _______% mensual, hasta la total liquidación del adeudo.</w:t>
+      </w:r>
+    </w:p>
+    <w:p>
+      <w:pPr>
+        <w:spacing w:before="240"/>
+        <w:jc w:val="left"/>
+      </w:pPr>
       <w:r>
         <w:rPr>
           <w:b/>
           <w:bCs/>
         </w:rPr>
-        <w:t>, HIDALGO</w:t>
-      </w:r>
-      <w:r>
-        <w:t xml:space="preserve"> O EN EL DOMICILIO QUE EL ACREEDOR DESIGNE POR ESCRITO.</w:t>
+        <w:t xml:space="preserve">DATOS DEL SUSCRIPTOR (DEUDOR)</w:t>
+      </w:r>
+    </w:p>
+    <w:p>
+      <w:pPr>
+        <w:jc w:val="left"/>
+      </w:pPr>
+      <w:r>
+        <w:t xml:space="preserve">Nombre completo: {nombre}</w:t>
+      </w:r>
+    </w:p>
+    <w:p>
+      <w:pPr>
+        <w:jc w:val="left"/>
+      </w:pPr>
+      <w:r>
+        <w:t xml:space="preserve">Domicilio: {domicilio}</w:t>
+      </w:r>
+    </w:p>
+    <w:p>
+      <w:pPr>
+        <w:jc w:val="left"/>
+      </w:pPr>
+      <w:r>
+        <w:t xml:space="preserve">Identificación oficial: {identificacion}</w:t>
+      </w:r>
+    </w:p>
+    <w:p>
+      <w:pPr>
+        <w:spacing w:before="360"/>
+        <w:jc w:val="left"/>
+      </w:pPr>
+      <w:r>
+        <w:t xml:space="preserve">Firma: ____________________________________________________</w:t>
+      </w:r>
+    </w:p>
+    <w:p>
+      <w:pPr>
+        <w:spacing w:before="240"/>
+        <w:jc w:val="left"/>
+      </w:pPr>
+      <w:r>
+        <w:rPr>
+          <w:b/>
+          <w:bCs/>
+        </w:rPr>
+        <w:t xml:space="preserve">DATOS DEL AVAL</w:t>
       </w:r>
     </w:p>
     <w:p>
@@ -102,74 +156,105 @@
         <w:jc w:val="both"/>
       </w:pPr>
       <w:r>
-        <w:t>5. GASTOS: CUALQUIER GASTO, DESEMBOLSO O COMISIÓN QUE SE ORIGINE POR LA COBRANZA O POR INCUMPLIMIENTO SERÁ RESPONSABILIDAD DE EL DEUDOR.</w:t>
-      </w:r>
-    </w:p>
-    <w:p>
-      <w:r>
-        <w:t>6. JURISDICCIÓN: PARA LA INTERPRETACIÓN Y CUMPLIMIENTO DE ESTE DOCUMENTO, AMBAS PARTES SE SOMETEN A LAS LEYES Y TRIBUNALES COMPETENTES DE LA CIUDAD DE PACHUCA DE SOTO, HIDALGO.</w:t>
-      </w:r>
-    </w:p>
-    <w:p/>
-    <w:tbl>
-      <w:tblPr>
-        <w:tblStyle w:val="a"/>
-        <w:tblW w:w="8640" w:type="dxa"/>
-        <w:tblInd w:w="-108" w:type="dxa"/>
-        <w:tblBorders>
-          <w:top w:val="single" w:sz="4" w:space="0" w:color="000000"/>
-          <w:left w:val="single" w:sz="4" w:space="0" w:color="000000"/>
-          <w:bottom w:val="single" w:sz="4" w:space="0" w:color="000000"/>
-          <w:right w:val="single" w:sz="4" w:space="0" w:color="000000"/>
-          <w:insideH w:val="single" w:sz="4" w:space="0" w:color="000000"/>
-          <w:insideV w:val="single" w:sz="4" w:space="0" w:color="000000"/>
-        </w:tblBorders>
-        <w:tblLayout w:type="fixed"/>
-        <w:tblLook w:val="0400" w:firstRow="0" w:lastRow="0" w:firstColumn="0" w:lastColumn="0" w:noHBand="0" w:noVBand="1"/>
-      </w:tblPr>
-      <w:tblGrid>
-        <w:gridCol w:w="8640"/>
-      </w:tblGrid>
-      <w:tr>
-        <w:tc>
-          <w:tcPr>
-            <w:tcW w:w="8640" w:type="dxa"/>
-          </w:tcPr>
-          <w:p/>
-          <w:p>
-            <w:r>
-              <w:t xml:space="preserve">LUGAR Y FECHA: </w:t>
-            </w:r>
-          </w:p>
-        </w:tc>
-      </w:tr>
-      <w:tr>
-        <w:tc>
-          <w:tcPr>
-            <w:tcW w:w="8640" w:type="dxa"/>
-          </w:tcPr>
-          <w:p/>
-          <w:p>
-            <w:r>
-              <w:br/>
-              <w:t>NOMBRE Y FIRMA DE EL DEUDOR:</w:t>
-            </w:r>
-          </w:p>
-        </w:tc>
-      </w:tr>
-    </w:tbl>
-    <w:p>
-      <w:pPr>
-        <w:widowControl w:val="0"/>
-        <w:pBdr>
-          <w:top w:val="nil"/>
-          <w:left w:val="nil"/>
-          <w:bottom w:val="nil"/>
-          <w:right w:val="nil"/>
-          <w:between w:val="nil"/>
-        </w:pBdr>
-        <w:spacing w:after="0"/>
-      </w:pPr>
+        <w:t xml:space="preserve">Por medio del presente, yo, {aval_nombre}, declaro que avalo al suscriptor de este pagaré y garantizo el pago total de la obligación consignada en el mismo, obligándome solidariamente en los términos de la Ley General de Títulos y Operaciones de Crédito.</w:t>
+      </w:r>
+    </w:p>
+    <w:p>
+      <w:pPr>
+        <w:jc w:val="left"/>
+      </w:pPr>
+      <w:r>
+        <w:t xml:space="preserve">Domicilio: {aval_domicilio}</w:t>
+      </w:r>
+    </w:p>
+    <w:p>
+      <w:pPr>
+        <w:jc w:val="left"/>
+      </w:pPr>
+      <w:r>
+        <w:t xml:space="preserve">Identificación oficial: _______________________________________</w:t>
+      </w:r>
+    </w:p>
+    <w:p>
+      <w:pPr>
+        <w:spacing w:before="360"/>
+        <w:jc w:val="left"/>
+      </w:pPr>
+      <w:r>
+        <w:t xml:space="preserve">NOMBRE Y FIRMA DEL AVAL: ____________________________________</w:t>
+      </w:r>
+    </w:p>
+    <w:p>
+      <w:pPr>
+        <w:spacing w:before="240"/>
+        <w:jc w:val="left"/>
+      </w:pPr>
+      <w:r>
+        <w:rPr>
+          <w:b/>
+          <w:bCs/>
+        </w:rPr>
+        <w:t xml:space="preserve">TESTIGOS</w:t>
+      </w:r>
+    </w:p>
+    <w:p>
+      <w:pPr>
+        <w:jc w:val="left"/>
+      </w:pPr>
+      <w:r>
+        <w:rPr>
+          <w:b/>
+          <w:bCs/>
+        </w:rPr>
+        <w:t xml:space="preserve">TESTIGO 1</w:t>
+      </w:r>
+    </w:p>
+    <w:p>
+      <w:pPr>
+        <w:jc w:val="left"/>
+      </w:pPr>
+      <w:r>
+        <w:t xml:space="preserve">Nombre: ___________________________________________________</w:t>
+      </w:r>
+    </w:p>
+    <w:p>
+      <w:pPr>
+        <w:spacing w:before="240"/>
+        <w:jc w:val="left"/>
+      </w:pPr>
+      <w:r>
+        <w:t xml:space="preserve">Firma: ____________________________________________________</w:t>
+      </w:r>
+    </w:p>
+    <w:p>
+      <w:pPr>
+        <w:spacing w:before="120"/>
+        <w:jc w:val="left"/>
+      </w:pPr>
+      <w:r>
+        <w:rPr>
+          <w:b/>
+          <w:bCs/>
+        </w:rPr>
+        <w:t xml:space="preserve">TESTIGO 2</w:t>
+      </w:r>
+    </w:p>
+    <w:p>
+      <w:pPr>
+        <w:jc w:val="left"/>
+      </w:pPr>
+      <w:r>
+        <w:t xml:space="preserve">Nombre: ___________________________________________________</w:t>
+      </w:r>
+    </w:p>
+    <w:p>
+      <w:pPr>
+        <w:spacing w:before="240"/>
+        <w:jc w:val="left"/>
+      </w:pPr>
+      <w:r>
+        <w:t xml:space="preserve">Firma: ____________________________________________________</w:t>
+      </w:r>
     </w:p>
     <w:sectPr>
       <w:pgSz w:w="12240" w:h="15840"/>

</xml_diff>